<commit_message>
compiled with native MS Word Equation structures, standard scientific symbols, and zero raw caret (^) or underscore (_) artifacts.
</commit_message>
<xml_diff>
--- a/Paper/title_page.docx
+++ b/Paper/title_page.docx
@@ -53,7 +53,7 @@
           <w:rFonts w:ascii="Times New Roman" w:hAnsi="Times New Roman"/>
           <w:sz w:val="20"/>
         </w:rPr>
-        <w:t>Dr. Eng. Kadeghe Goodluck Fue</w:t>
+        <w:t>Kadeghe Goodluck Fue</w:t>
       </w:r>
     </w:p>
     <w:p>
@@ -264,7 +264,7 @@
           <w:rFonts w:ascii="Times New Roman" w:hAnsi="Times New Roman"/>
           <w:sz w:val="20"/>
         </w:rPr>
-        <w:t xml:space="preserve"> is a Senior Lecturer in the Department of Agricultural Engineering, School of Engineering and Technology, at Sokoine University of Agriculture (SUA) in Morogoro, Tanzania, where he leads the Electronics and Precision Agriculture Lab (EPALab). He holds a Ph.D. in Engineering from the University of Georgia, an M.Sc. in Agricultural and Biological Engineering from the University of Florida, and a B.Sc. in Computer Engineering and Information Technology from the University of Dar es Salaam. His research focuses on precision agriculture, artificial intelligence, spatial machine learning, and climate-resilient smallholder farming systems, driven by a deep commitment to advancing food security across sub-Saharan Africa.</w:t>
+        <w:t xml:space="preserve"> is a Senior Lecturer in the Department of Agricultural Engineering, School of Engineering and Technology, at Sokoine University of Agriculture (SUA) in Morogoro, Tanzania, where he leads the Electronics and Precision Agriculture Lab (EPALab). He holds a Ph.D. in Engineering from the University of Georgia, an M.Sc. in Agricultural and Biological Engineering from the University of Florida, and a B.Sc. in Computer Engineering and Information Technology from the University of Dar es Salaam. His research focuses on precision agriculture, artificial intelligence, spatial machine learning, Agricultural Data Science, and climate-resilient smallholder farming systems, driven by a deep commitment to advancing food security across sub-Saharan Africa.</w:t>
       </w:r>
     </w:p>
     <w:sectPr>

</xml_diff>